<commit_message>
feat(week5): implement dynamic branch and category filters with real-time recalculations
</commit_message>
<xml_diff>
--- a/02_Labs_Assignments/Week5/Dashboard-6752300313-Submission.docx
+++ b/02_Labs_Assignments/Week5/Dashboard-6752300313-Submission.docx
@@ -438,9 +438,148 @@
           <w:color w:val="64748B"/>
           <w:sz w:val="17"/>
         </w:rPr>
-        <w:t>ภาพที่ 1: หน้าจอแสดงผล Cafe &amp; Bakery Sales Analytics Dashboard พร้อม Interactive 3D Model และ KPIs</w:t>
+        <w:t>ภาพที่ 1: หน้าจอแสดงผล Cafe &amp; Bakery Sales Analytics Dashboard พร้อม Interactive Dynamic Filter, 2D Studio Photography และ KPIs</w:t>
       </w:r>
     </w:p>
+    <w:tbl>
+      <w:tblPr>
+        <w:tblW w:type="auto" w:w="0"/>
+        <w:jc w:val="center"/>
+        <w:tblLook w:firstColumn="1" w:firstRow="1" w:lastColumn="0" w:lastRow="0" w:noHBand="0" w:noVBand="1" w:val="04A0"/>
+      </w:tblPr>
+      <w:tblGrid>
+        <w:gridCol w:w="10224"/>
+      </w:tblGrid>
+      <w:tr>
+        <w:tc>
+          <w:tcPr>
+            <w:tcW w:type="dxa" w:w="10080"/>
+            <w:shd w:fill="F8FAFC"/>
+            <w:tcMar>
+              <w:top w:w="120" w:type="dxa"/>
+              <w:bottom w:w="120" w:type="dxa"/>
+              <w:left w:w="160" w:type="dxa"/>
+              <w:right w:w="160" w:type="dxa"/>
+            </w:tcMar>
+          </w:tcPr>
+          <w:p>
+            <w:pPr>
+              <w:spacing w:before="40" w:after="80"/>
+            </w:pPr>
+            <w:r>
+              <w:rPr>
+                <w:rFonts w:ascii="Leelawadee UI" w:hAnsi="Leelawadee UI" w:cs="Leelawadee UI" w:eastAsia="Leelawadee UI"/>
+                <w:b/>
+                <w:i w:val="0"/>
+                <w:color w:val="0F172A"/>
+                <w:sz w:val="21"/>
+              </w:rPr>
+              <w:t>⭐ จุดเด่นและการตอบโจทย์ตามข้อกำหนด (Technical &amp; Business Highlights):</w:t>
+            </w:r>
+          </w:p>
+          <w:p>
+            <w:pPr>
+              <w:spacing w:before="20" w:after="40"/>
+            </w:pPr>
+            <w:r>
+              <w:rPr>
+                <w:rFonts w:ascii="Leelawadee UI" w:hAnsi="Leelawadee UI" w:cs="Leelawadee UI" w:eastAsia="Leelawadee UI"/>
+                <w:b/>
+                <w:i w:val="0"/>
+                <w:color w:val="1E3A8A"/>
+                <w:sz w:val="19"/>
+              </w:rPr>
+              <w:t xml:space="preserve">⚡ Dynamic Real-time Filters: </w:t>
+            </w:r>
+            <w:r>
+              <w:rPr>
+                <w:rFonts w:ascii="Leelawadee UI" w:hAnsi="Leelawadee UI" w:cs="Leelawadee UI" w:eastAsia="Leelawadee UI"/>
+                <w:b w:val="0"/>
+                <w:i w:val="0"/>
+                <w:color w:val="334155"/>
+                <w:sz w:val="19"/>
+              </w:rPr>
+              <w:t>ระบบตัวกรองสาขา (มหาวิทยาลัย, สำนักงาน, ห้างสรรพสินค้า) และหมวดหมู่สินค้า ที่คำนวณและปรับตัวเลข KPI, สัดส่วน %, กราฟแนวโน้มรายวันแบบเรียลไทม์ 100% Client-side</w:t>
+            </w:r>
+          </w:p>
+          <w:p>
+            <w:pPr>
+              <w:spacing w:before="20" w:after="40"/>
+            </w:pPr>
+            <w:r>
+              <w:rPr>
+                <w:rFonts w:ascii="Leelawadee UI" w:hAnsi="Leelawadee UI" w:cs="Leelawadee UI" w:eastAsia="Leelawadee UI"/>
+                <w:b/>
+                <w:i w:val="0"/>
+                <w:color w:val="1E3A8A"/>
+                <w:sz w:val="19"/>
+              </w:rPr>
+              <w:t xml:space="preserve">📷 High-res 2D Studio Photography: </w:t>
+            </w:r>
+            <w:r>
+              <w:rPr>
+                <w:rFonts w:ascii="Leelawadee UI" w:hAnsi="Leelawadee UI" w:cs="Leelawadee UI" w:eastAsia="Leelawadee UI"/>
+                <w:b w:val="0"/>
+                <w:i w:val="0"/>
+                <w:color w:val="334155"/>
+                <w:sz w:val="19"/>
+              </w:rPr>
+              <w:t>ภาพถ่ายสินค้าแบบสตูดิโอความละเอียดสูง เพิ่มความน่าเชื่อถือระดับมืออาชีพ พร้อมระบบ Zero-fail Inline SVG Fallback เมื่อเปิดในโหมดออฟไลน์</w:t>
+            </w:r>
+          </w:p>
+          <w:p>
+            <w:pPr>
+              <w:spacing w:before="20" w:after="40"/>
+            </w:pPr>
+            <w:r>
+              <w:rPr>
+                <w:rFonts w:ascii="Leelawadee UI" w:hAnsi="Leelawadee UI" w:cs="Leelawadee UI" w:eastAsia="Leelawadee UI"/>
+                <w:b/>
+                <w:i w:val="0"/>
+                <w:color w:val="1E3A8A"/>
+                <w:sz w:val="19"/>
+              </w:rPr>
+              <w:t xml:space="preserve">🎯 100% Strict Compliance: </w:t>
+            </w:r>
+            <w:r>
+              <w:rPr>
+                <w:rFonts w:ascii="Leelawadee UI" w:hAnsi="Leelawadee UI" w:cs="Leelawadee UI" w:eastAsia="Leelawadee UI"/>
+                <w:b w:val="0"/>
+                <w:i w:val="0"/>
+                <w:color w:val="334155"/>
+                <w:sz w:val="19"/>
+              </w:rPr>
+              <w:t>ครอบคลุมครบทั้ง Prompt 1 (KPI รวม ฿72,530, ยอดขาย 1,000 ชิ้น, กำไร ฿38,825 / 53.53%, Top 3 สินค้าสูงสุด) และ Prompt 2 (ตาราง Cross-tab สินค้า × สาขา, สัดส่วนหมวดหมู่, ไทม์ไลน์ 31 วัน)</w:t>
+            </w:r>
+          </w:p>
+          <w:p>
+            <w:pPr>
+              <w:spacing w:before="20" w:after="40"/>
+            </w:pPr>
+            <w:r>
+              <w:rPr>
+                <w:rFonts w:ascii="Leelawadee UI" w:hAnsi="Leelawadee UI" w:cs="Leelawadee UI" w:eastAsia="Leelawadee UI"/>
+                <w:b/>
+                <w:i w:val="0"/>
+                <w:color w:val="1E3A8A"/>
+                <w:sz w:val="19"/>
+              </w:rPr>
+              <w:t xml:space="preserve">🚀 Zero-Dependency Architecture: </w:t>
+            </w:r>
+            <w:r>
+              <w:rPr>
+                <w:rFonts w:ascii="Leelawadee UI" w:hAnsi="Leelawadee UI" w:cs="Leelawadee UI" w:eastAsia="Leelawadee UI"/>
+                <w:b w:val="0"/>
+                <w:i w:val="0"/>
+                <w:color w:val="334155"/>
+                <w:sz w:val="19"/>
+              </w:rPr>
+              <w:t>เปิดใช้งานบนเว็บเบราว์เซอร์ได้ทันทีโดยไม่ต้องเชื่อมต่อระบบภายนอกหรือติดตั้งโปรแกรมเสริมใดๆ รองรับ Light/Dark Theme สมบูรณ์แบบ</w:t>
+            </w:r>
+          </w:p>
+        </w:tc>
+      </w:tr>
+    </w:tbl>
     <w:sectPr>
       <w:pgSz w:w="12240" w:h="15840"/>
       <w:pgMar w:top="936" w:right="1008" w:bottom="936" w:left="1008" w:header="720" w:footer="720" w:gutter="0"/>

</xml_diff>

<commit_message>
refactor(week5): prune filter toolbar and correct Top 3 percentage to revenue share (18.5%, 14.0%, 13.8%)
</commit_message>
<xml_diff>
--- a/02_Labs_Assignments/Week5/Dashboard-6752300313-Submission.docx
+++ b/02_Labs_Assignments/Week5/Dashboard-6752300313-Submission.docx
@@ -438,7 +438,7 @@
           <w:color w:val="64748B"/>
           <w:sz w:val="17"/>
         </w:rPr>
-        <w:t>ภาพที่ 1: หน้าจอแสดงผล Cafe &amp; Bakery Sales Analytics Dashboard พร้อม Interactive Dynamic Filter, 2D Studio Photography และ KPIs</w:t>
+        <w:t>ภาพที่ 1: หน้าจอแสดงผล Cafe &amp; Bakery Sales Analytics Dashboard พร้อมโครงสร้างมินิมอล, 2D Studio Photography และ KPIs</w:t>
       </w:r>
     </w:p>
     <w:tbl>
@@ -489,7 +489,7 @@
                 <w:color w:val="1E3A8A"/>
                 <w:sz w:val="19"/>
               </w:rPr>
-              <w:t xml:space="preserve">⚡ Dynamic Real-time Filters: </w:t>
+              <w:t xml:space="preserve">⚡ Clean Minimalist Architecture: </w:t>
             </w:r>
             <w:r>
               <w:rPr>
@@ -499,7 +499,7 @@
                 <w:color w:val="334155"/>
                 <w:sz w:val="19"/>
               </w:rPr>
-              <w:t>ระบบตัวกรองสาขา (มหาวิทยาลัย, สำนักงาน, ห้างสรรพสินค้า) และหมวดหมู่สินค้า ที่คำนวณและปรับตัวเลข KPI, สัดส่วน %, กราฟแนวโน้มรายวันแบบเรียลไทม์ 100% Client-side</w:t>
+              <w:t>การจัดวางโครงสร้างแบบ Executive Dashboard ที่เรียบหรู กระชับ ไร้ความซ้ำซ้อน นำเสนอตัวเลขผลประกอบการ 3 สาขา, สัดส่วนหมวดหมู่, และตาราง Cross-tab สินค้า × สาขาอย่างถูกต้องตามหลักสถิติ</w:t>
             </w:r>
           </w:p>
           <w:p>
@@ -549,7 +549,7 @@
                 <w:color w:val="334155"/>
                 <w:sz w:val="19"/>
               </w:rPr>
-              <w:t>ครอบคลุมครบทั้ง Prompt 1 (KPI รวม ฿72,530, ยอดขาย 1,000 ชิ้น, กำไร ฿38,825 / 53.53%, Top 3 สินค้าสูงสุด) และ Prompt 2 (ตาราง Cross-tab สินค้า × สาขา, สัดส่วนหมวดหมู่, ไทม์ไลน์ 31 วัน)</w:t>
+              <w:t>ครอบคลุมครบทั้ง Prompt 1 (KPI รวม ฿72,530, ยอดขาย 1,000 ชิ้น, กำไร ฿38,825 / 53.53%, Top 3 สินค้าสูงสุดพร้อม % สัดส่วนที่ถูกต้อง) และ Prompt 2 (ตาราง Cross-tab สินค้า × สาขา, สัดส่วนหมวดหมู่, ไทม์ไลน์ 31 วัน)</w:t>
             </w:r>
           </w:p>
           <w:p>
@@ -574,7 +574,7 @@
                 <w:color w:val="334155"/>
                 <w:sz w:val="19"/>
               </w:rPr>
-              <w:t>เปิดใช้งานบนเว็บเบราว์เซอร์ได้ทันทีโดยไม่ต้องเชื่อมต่อระบบภายนอกหรือติดตั้งโปรแกรมเสริมใดๆ รองรับ Light/Dark Theme สมบูรณ์แบบ</w:t>
+              <w:t>เปิดใช้งานบนเว็บเบราว์เซอร์ได้ทันทีโดยไม่ต้องเชื่อมต่อระบบภายนอกหรือติดตั้งโปรแกรมเสริมใดๆ รองรับ Light/Dark Theme และ Print Stylesheet สมบูรณ์แบบ</w:t>
             </w:r>
           </w:p>
         </w:tc>

</xml_diff>

<commit_message>
docs: update submission docx/pdf with TH SarabunPSK font, 2-page layout, and latest dashboard screenshot
</commit_message>
<xml_diff>
--- a/02_Labs_Assignments/Week5/Dashboard-6752300313-Submission.docx
+++ b/02_Labs_Assignments/Week5/Dashboard-6752300313-Submission.docx
@@ -9,64 +9,67 @@
         <w:tblLook w:firstColumn="1" w:firstRow="1" w:lastColumn="0" w:lastRow="0" w:noHBand="0" w:noVBand="1" w:val="04A0"/>
       </w:tblPr>
       <w:tblGrid>
-        <w:gridCol w:w="10224"/>
+        <w:gridCol w:w="10512"/>
       </w:tblGrid>
       <w:tr>
         <w:tc>
           <w:tcPr>
-            <w:tcW w:type="dxa" w:w="10080"/>
+            <w:tcW w:type="dxa" w:w="10224"/>
             <w:shd w:fill="0F172A"/>
             <w:tcMar>
-              <w:top w:w="180" w:type="dxa"/>
-              <w:bottom w:w="180" w:type="dxa"/>
-              <w:left w:w="240" w:type="dxa"/>
-              <w:right w:w="240" w:type="dxa"/>
+              <w:top w:w="100" w:type="dxa"/>
+              <w:bottom w:w="100" w:type="dxa"/>
+              <w:left w:w="180" w:type="dxa"/>
+              <w:right w:w="180" w:type="dxa"/>
             </w:tcMar>
           </w:tcPr>
           <w:p>
             <w:pPr>
-              <w:spacing w:before="80" w:after="40"/>
+              <w:spacing w:before="0" w:after="20"/>
               <w:jc w:val="center"/>
             </w:pPr>
             <w:r>
               <w:rPr>
-                <w:rFonts w:ascii="Leelawadee UI" w:hAnsi="Leelawadee UI" w:cs="Leelawadee UI" w:eastAsia="Leelawadee UI"/>
+                <w:rFonts w:ascii="TH SarabunPSK" w:hAnsi="TH SarabunPSK" w:cs="TH SarabunPSK" w:eastAsia="TH SarabunPSK"/>
                 <w:b w:val="0"/>
                 <w:i w:val="0"/>
                 <w:color w:val="94A3B8"/>
-                <w:sz w:val="19"/>
+                <w:sz w:val="27"/>
+                <w:szCs w:val="27"/>
               </w:rPr>
               <w:t>สถาบันการจัดการปัญญาภิวัฒน์ (PIM) · สาขาวิศวกรรมคอมพิวเตอร์และปัญญาประดิษฐ์ (CAI)</w:t>
             </w:r>
           </w:p>
           <w:p>
             <w:pPr>
-              <w:spacing w:before="40" w:after="40"/>
+              <w:spacing w:before="20" w:after="20"/>
               <w:jc w:val="center"/>
             </w:pPr>
             <w:r>
               <w:rPr>
-                <w:rFonts w:ascii="Leelawadee UI" w:hAnsi="Leelawadee UI" w:cs="Leelawadee UI" w:eastAsia="Leelawadee UI"/>
+                <w:rFonts w:ascii="TH SarabunPSK" w:hAnsi="TH SarabunPSK" w:cs="TH SarabunPSK" w:eastAsia="TH SarabunPSK"/>
                 <w:b/>
                 <w:i w:val="0"/>
                 <w:color w:val="FFFFFF"/>
-                <w:sz w:val="32"/>
+                <w:sz w:val="38"/>
+                <w:szCs w:val="38"/>
               </w:rPr>
               <w:t>ใบงานส่งมอบผลงาน: Dashboard (5 คะแนน)</w:t>
             </w:r>
           </w:p>
           <w:p>
             <w:pPr>
-              <w:spacing w:before="40" w:after="80"/>
+              <w:spacing w:before="20" w:after="0"/>
               <w:jc w:val="center"/>
             </w:pPr>
             <w:r>
               <w:rPr>
-                <w:rFonts w:ascii="Leelawadee UI" w:hAnsi="Leelawadee UI" w:cs="Leelawadee UI" w:eastAsia="Leelawadee UI"/>
+                <w:rFonts w:ascii="TH SarabunPSK" w:hAnsi="TH SarabunPSK" w:cs="TH SarabunPSK" w:eastAsia="TH SarabunPSK"/>
                 <w:b/>
                 <w:i w:val="0"/>
                 <w:color w:val="38BDF8"/>
-                <w:sz w:val="21"/>
+                <w:sz w:val="28"/>
+                <w:szCs w:val="28"/>
               </w:rPr>
               <w:t>รายวิชา SC60107 การจัดการเทคโนโลยีสารสนเทศทางธุรกิจ · ภาคการศึกษา 1/2569</w:t>
             </w:r>
@@ -74,11 +77,6 @@
         </w:tc>
       </w:tr>
     </w:tbl>
-    <w:p>
-      <w:pPr>
-        <w:spacing w:after="80"/>
-      </w:pPr>
-    </w:p>
     <w:tbl>
       <w:tblPr>
         <w:tblW w:type="auto" w:w="0"/>
@@ -86,42 +84,44 @@
         <w:tblLook w:firstColumn="1" w:firstRow="1" w:lastColumn="0" w:lastRow="0" w:noHBand="0" w:noVBand="1" w:val="04A0"/>
       </w:tblPr>
       <w:tblGrid>
-        <w:gridCol w:w="5112"/>
-        <w:gridCol w:w="5112"/>
+        <w:gridCol w:w="5256"/>
+        <w:gridCol w:w="5256"/>
       </w:tblGrid>
       <w:tr>
         <w:tc>
           <w:tcPr>
-            <w:tcW w:type="dxa" w:w="5040"/>
+            <w:tcW w:type="dxa" w:w="5112"/>
             <w:shd w:fill="F8FAFC"/>
             <w:tcMar>
-              <w:top w:w="100" w:type="dxa"/>
-              <w:bottom w:w="100" w:type="dxa"/>
-              <w:left w:w="140" w:type="dxa"/>
-              <w:right w:w="140" w:type="dxa"/>
+              <w:top w:w="60" w:type="dxa"/>
+              <w:bottom w:w="60" w:type="dxa"/>
+              <w:left w:w="120" w:type="dxa"/>
+              <w:right w:w="120" w:type="dxa"/>
             </w:tcMar>
           </w:tcPr>
           <w:p>
             <w:pPr>
-              <w:spacing w:after="0"/>
+              <w:spacing w:after="0" w:before="0"/>
             </w:pPr>
             <w:r>
               <w:rPr>
-                <w:rFonts w:ascii="Leelawadee UI" w:hAnsi="Leelawadee UI" w:cs="Leelawadee UI" w:eastAsia="Leelawadee UI"/>
+                <w:rFonts w:ascii="TH SarabunPSK" w:hAnsi="TH SarabunPSK" w:cs="TH SarabunPSK" w:eastAsia="TH SarabunPSK"/>
                 <w:b/>
                 <w:i w:val="0"/>
                 <w:color w:val="64748B"/>
-                <w:sz w:val="20"/>
+                <w:sz w:val="29"/>
+                <w:szCs w:val="29"/>
               </w:rPr>
               <w:t xml:space="preserve">👤 ผู้จัดทำ: </w:t>
             </w:r>
             <w:r>
               <w:rPr>
-                <w:rFonts w:ascii="Leelawadee UI" w:hAnsi="Leelawadee UI" w:cs="Leelawadee UI" w:eastAsia="Leelawadee UI"/>
+                <w:rFonts w:ascii="TH SarabunPSK" w:hAnsi="TH SarabunPSK" w:cs="TH SarabunPSK" w:eastAsia="TH SarabunPSK"/>
                 <w:b/>
                 <w:i w:val="0"/>
                 <w:color w:val="0F172A"/>
-                <w:sz w:val="21"/>
+                <w:sz w:val="30"/>
+                <w:szCs w:val="30"/>
               </w:rPr>
               <w:t>นายภูริพัฒน์ เหมะกุล</w:t>
             </w:r>
@@ -129,36 +129,38 @@
         </w:tc>
         <w:tc>
           <w:tcPr>
-            <w:tcW w:type="dxa" w:w="5040"/>
+            <w:tcW w:type="dxa" w:w="5112"/>
             <w:shd w:fill="F8FAFC"/>
             <w:tcMar>
-              <w:top w:w="100" w:type="dxa"/>
-              <w:bottom w:w="100" w:type="dxa"/>
-              <w:left w:w="140" w:type="dxa"/>
-              <w:right w:w="140" w:type="dxa"/>
+              <w:top w:w="60" w:type="dxa"/>
+              <w:bottom w:w="60" w:type="dxa"/>
+              <w:left w:w="120" w:type="dxa"/>
+              <w:right w:w="120" w:type="dxa"/>
             </w:tcMar>
           </w:tcPr>
           <w:p>
             <w:pPr>
-              <w:spacing w:after="0"/>
+              <w:spacing w:after="0" w:before="0"/>
             </w:pPr>
             <w:r>
               <w:rPr>
-                <w:rFonts w:ascii="Leelawadee UI" w:hAnsi="Leelawadee UI" w:cs="Leelawadee UI" w:eastAsia="Leelawadee UI"/>
+                <w:rFonts w:ascii="TH SarabunPSK" w:hAnsi="TH SarabunPSK" w:cs="TH SarabunPSK" w:eastAsia="TH SarabunPSK"/>
                 <w:b/>
                 <w:i w:val="0"/>
                 <w:color w:val="64748B"/>
-                <w:sz w:val="20"/>
+                <w:sz w:val="29"/>
+                <w:szCs w:val="29"/>
               </w:rPr>
               <w:t xml:space="preserve">🆔 รหัสนักศึกษา: </w:t>
             </w:r>
             <w:r>
               <w:rPr>
-                <w:rFonts w:ascii="Leelawadee UI" w:hAnsi="Leelawadee UI" w:cs="Leelawadee UI" w:eastAsia="Leelawadee UI"/>
+                <w:rFonts w:ascii="TH SarabunPSK" w:hAnsi="TH SarabunPSK" w:cs="TH SarabunPSK" w:eastAsia="TH SarabunPSK"/>
                 <w:b/>
                 <w:i w:val="0"/>
                 <w:color w:val="2563EB"/>
-                <w:sz w:val="21"/>
+                <w:sz w:val="30"/>
+                <w:szCs w:val="30"/>
               </w:rPr>
               <w:t>6752300313 (กลุ่ม 1.2-1)</w:t>
             </w:r>
@@ -168,73 +170,77 @@
       <w:tr>
         <w:tc>
           <w:tcPr>
-            <w:tcW w:type="dxa" w:w="5040"/>
+            <w:tcW w:type="dxa" w:w="5112"/>
             <w:shd w:fill="F8FAFC"/>
             <w:tcMar>
-              <w:top w:w="100" w:type="dxa"/>
-              <w:bottom w:w="100" w:type="dxa"/>
-              <w:left w:w="140" w:type="dxa"/>
-              <w:right w:w="140" w:type="dxa"/>
+              <w:top w:w="60" w:type="dxa"/>
+              <w:bottom w:w="60" w:type="dxa"/>
+              <w:left w:w="120" w:type="dxa"/>
+              <w:right w:w="120" w:type="dxa"/>
             </w:tcMar>
           </w:tcPr>
           <w:p>
             <w:pPr>
-              <w:spacing w:after="0"/>
+              <w:spacing w:after="0" w:before="0"/>
             </w:pPr>
             <w:r>
               <w:rPr>
-                <w:rFonts w:ascii="Leelawadee UI" w:hAnsi="Leelawadee UI" w:cs="Leelawadee UI" w:eastAsia="Leelawadee UI"/>
+                <w:rFonts w:ascii="TH SarabunPSK" w:hAnsi="TH SarabunPSK" w:cs="TH SarabunPSK" w:eastAsia="TH SarabunPSK"/>
                 <w:b/>
                 <w:i w:val="0"/>
                 <w:color w:val="64748B"/>
-                <w:sz w:val="20"/>
+                <w:sz w:val="29"/>
+                <w:szCs w:val="29"/>
               </w:rPr>
               <w:t xml:space="preserve">🎯 หัวข้องาน: </w:t>
             </w:r>
             <w:r>
               <w:rPr>
-                <w:rFonts w:ascii="Leelawadee UI" w:hAnsi="Leelawadee UI" w:cs="Leelawadee UI" w:eastAsia="Leelawadee UI"/>
+                <w:rFonts w:ascii="TH SarabunPSK" w:hAnsi="TH SarabunPSK" w:cs="TH SarabunPSK" w:eastAsia="TH SarabunPSK"/>
                 <w:b w:val="0"/>
                 <w:i w:val="0"/>
                 <w:color w:val="0F172A"/>
-                <w:sz w:val="20"/>
+                <w:sz w:val="29"/>
+                <w:szCs w:val="29"/>
               </w:rPr>
-              <w:t>Cafe &amp; Bakery Sales Analytics Dashboard (Amazon Quick Workshop)</w:t>
+              <w:t>Cafe &amp; Bakery Sales Analytics Dashboard</w:t>
             </w:r>
           </w:p>
         </w:tc>
         <w:tc>
           <w:tcPr>
-            <w:tcW w:type="dxa" w:w="5040"/>
+            <w:tcW w:type="dxa" w:w="5112"/>
             <w:shd w:fill="F8FAFC"/>
             <w:tcMar>
-              <w:top w:w="100" w:type="dxa"/>
-              <w:bottom w:w="100" w:type="dxa"/>
-              <w:left w:w="140" w:type="dxa"/>
-              <w:right w:w="140" w:type="dxa"/>
+              <w:top w:w="60" w:type="dxa"/>
+              <w:bottom w:w="60" w:type="dxa"/>
+              <w:left w:w="120" w:type="dxa"/>
+              <w:right w:w="120" w:type="dxa"/>
             </w:tcMar>
           </w:tcPr>
           <w:p>
             <w:pPr>
-              <w:spacing w:after="0"/>
+              <w:spacing w:after="0" w:before="0"/>
             </w:pPr>
             <w:r>
               <w:rPr>
-                <w:rFonts w:ascii="Leelawadee UI" w:hAnsi="Leelawadee UI" w:cs="Leelawadee UI" w:eastAsia="Leelawadee UI"/>
+                <w:rFonts w:ascii="TH SarabunPSK" w:hAnsi="TH SarabunPSK" w:cs="TH SarabunPSK" w:eastAsia="TH SarabunPSK"/>
                 <w:b/>
                 <w:i w:val="0"/>
                 <w:color w:val="64748B"/>
-                <w:sz w:val="20"/>
+                <w:sz w:val="29"/>
+                <w:szCs w:val="29"/>
               </w:rPr>
               <w:t xml:space="preserve">📅 วันที่ส่งงาน: </w:t>
             </w:r>
             <w:r>
               <w:rPr>
-                <w:rFonts w:ascii="Leelawadee UI" w:hAnsi="Leelawadee UI" w:cs="Leelawadee UI" w:eastAsia="Leelawadee UI"/>
+                <w:rFonts w:ascii="TH SarabunPSK" w:hAnsi="TH SarabunPSK" w:cs="TH SarabunPSK" w:eastAsia="TH SarabunPSK"/>
                 <w:b w:val="0"/>
                 <w:i w:val="0"/>
                 <w:color w:val="0F172A"/>
-                <w:sz w:val="20"/>
+                <w:sz w:val="29"/>
+                <w:szCs w:val="29"/>
               </w:rPr>
               <w:t>16 ตุลาคม 2569</w:t>
             </w:r>
@@ -242,11 +248,6 @@
         </w:tc>
       </w:tr>
     </w:tbl>
-    <w:p>
-      <w:pPr>
-        <w:spacing w:after="80"/>
-      </w:pPr>
-    </w:p>
     <w:tbl>
       <w:tblPr>
         <w:tblW w:type="auto" w:w="0"/>
@@ -254,46 +255,48 @@
         <w:tblLook w:firstColumn="1" w:firstRow="1" w:lastColumn="0" w:lastRow="0" w:noHBand="0" w:noVBand="1" w:val="04A0"/>
       </w:tblPr>
       <w:tblGrid>
-        <w:gridCol w:w="10224"/>
+        <w:gridCol w:w="10512"/>
       </w:tblGrid>
       <w:tr>
         <w:tc>
           <w:tcPr>
-            <w:tcW w:type="dxa" w:w="10080"/>
+            <w:tcW w:type="dxa" w:w="10224"/>
             <w:shd w:fill="EFF6FF"/>
             <w:tcMar>
-              <w:top w:w="140" w:type="dxa"/>
-              <w:bottom w:w="140" w:type="dxa"/>
-              <w:left w:w="180" w:type="dxa"/>
-              <w:right w:w="180" w:type="dxa"/>
+              <w:top w:w="80" w:type="dxa"/>
+              <w:bottom w:w="80" w:type="dxa"/>
+              <w:left w:w="150" w:type="dxa"/>
+              <w:right w:w="150" w:type="dxa"/>
             </w:tcMar>
           </w:tcPr>
           <w:p>
             <w:pPr>
-              <w:spacing w:before="40" w:after="80"/>
+              <w:spacing w:before="0" w:after="20"/>
             </w:pPr>
             <w:r>
               <w:rPr>
-                <w:rFonts w:ascii="Leelawadee UI" w:hAnsi="Leelawadee UI" w:cs="Leelawadee UI" w:eastAsia="Leelawadee UI"/>
+                <w:rFonts w:ascii="TH SarabunPSK" w:hAnsi="TH SarabunPSK" w:cs="TH SarabunPSK" w:eastAsia="TH SarabunPSK"/>
                 <w:b/>
                 <w:i w:val="0"/>
                 <w:color w:val="1E3A8A"/>
-                <w:sz w:val="22"/>
+                <w:sz w:val="31"/>
+                <w:szCs w:val="31"/>
               </w:rPr>
               <w:t>🔗 ช่องทางการเข้าชมและตรวจประเมินผลงาน (Clickable Links):</w:t>
             </w:r>
           </w:p>
           <w:p>
             <w:pPr>
-              <w:spacing w:before="40" w:after="40"/>
+              <w:spacing w:before="0" w:after="20"/>
             </w:pPr>
             <w:r>
               <w:rPr>
-                <w:rFonts w:ascii="Leelawadee UI" w:hAnsi="Leelawadee UI" w:cs="Leelawadee UI" w:eastAsia="Leelawadee UI"/>
+                <w:rFonts w:ascii="TH SarabunPSK" w:hAnsi="TH SarabunPSK" w:cs="TH SarabunPSK" w:eastAsia="TH SarabunPSK"/>
                 <w:b/>
                 <w:i w:val="0"/>
                 <w:color w:val="0F172A"/>
-                <w:sz w:val="20"/>
+                <w:sz w:val="29"/>
+                <w:szCs w:val="29"/>
               </w:rPr>
               <w:t xml:space="preserve">🌐 1. Live Web Application (GitHub Pages): </w:t>
             </w:r>
@@ -304,23 +307,25 @@
                   <w:color w:val="1D4ED8"/>
                   <w:u w:val="single"/>
                   <w:b/>
-                  <w:rFonts w:ascii="Leelawadee UI" w:hAnsi="Leelawadee UI" w:cs="Leelawadee UI" w:eastAsia="Leelawadee UI"/>
-                  <w:sz w:val="21"/>
+                  <w:rFonts w:ascii="TH SarabunPSK" w:hAnsi="TH SarabunPSK" w:cs="TH SarabunPSK" w:eastAsia="TH SarabunPSK"/>
+                  <w:sz w:val="29"/>
+                  <w:szCs w:val="29"/>
                 </w:rPr>
               </w:r>
             </w:hyperlink>
           </w:p>
           <w:p>
             <w:pPr>
-              <w:spacing w:before="40" w:after="40"/>
+              <w:spacing w:before="0" w:after="20"/>
             </w:pPr>
             <w:r>
               <w:rPr>
-                <w:rFonts w:ascii="Leelawadee UI" w:hAnsi="Leelawadee UI" w:cs="Leelawadee UI" w:eastAsia="Leelawadee UI"/>
+                <w:rFonts w:ascii="TH SarabunPSK" w:hAnsi="TH SarabunPSK" w:cs="TH SarabunPSK" w:eastAsia="TH SarabunPSK"/>
                 <w:b/>
                 <w:i w:val="0"/>
                 <w:color w:val="0F172A"/>
-                <w:sz w:val="20"/>
+                <w:sz w:val="29"/>
+                <w:szCs w:val="29"/>
               </w:rPr>
               <w:t xml:space="preserve">📄 2. Direct HTML URL (ไฟล์ตรง): </w:t>
             </w:r>
@@ -330,23 +335,25 @@
                 <w:rPr>
                   <w:color w:val="2563EB"/>
                   <w:u w:val="single"/>
-                  <w:rFonts w:ascii="Leelawadee UI" w:hAnsi="Leelawadee UI" w:cs="Leelawadee UI" w:eastAsia="Leelawadee UI"/>
-                  <w:sz w:val="21"/>
+                  <w:rFonts w:ascii="TH SarabunPSK" w:hAnsi="TH SarabunPSK" w:cs="TH SarabunPSK" w:eastAsia="TH SarabunPSK"/>
+                  <w:sz w:val="29"/>
+                  <w:szCs w:val="29"/>
                 </w:rPr>
               </w:r>
             </w:hyperlink>
           </w:p>
           <w:p>
             <w:pPr>
-              <w:spacing w:before="40" w:after="40"/>
+              <w:spacing w:before="0" w:after="0"/>
             </w:pPr>
             <w:r>
               <w:rPr>
-                <w:rFonts w:ascii="Leelawadee UI" w:hAnsi="Leelawadee UI" w:cs="Leelawadee UI" w:eastAsia="Leelawadee UI"/>
+                <w:rFonts w:ascii="TH SarabunPSK" w:hAnsi="TH SarabunPSK" w:cs="TH SarabunPSK" w:eastAsia="TH SarabunPSK"/>
                 <w:b/>
                 <w:i w:val="0"/>
                 <w:color w:val="0F172A"/>
-                <w:sz w:val="20"/>
+                <w:sz w:val="29"/>
+                <w:szCs w:val="29"/>
               </w:rPr>
               <w:t xml:space="preserve">💻 3. GitHub Course Repository (Source Code): </w:t>
             </w:r>
@@ -356,8 +363,9 @@
                 <w:rPr>
                   <w:color w:val="2563EB"/>
                   <w:u w:val="single"/>
-                  <w:rFonts w:ascii="Leelawadee UI" w:hAnsi="Leelawadee UI" w:cs="Leelawadee UI" w:eastAsia="Leelawadee UI"/>
-                  <w:sz w:val="21"/>
+                  <w:rFonts w:ascii="TH SarabunPSK" w:hAnsi="TH SarabunPSK" w:cs="TH SarabunPSK" w:eastAsia="TH SarabunPSK"/>
+                  <w:sz w:val="29"/>
+                  <w:szCs w:val="29"/>
                 </w:rPr>
               </w:r>
             </w:hyperlink>
@@ -365,35 +373,184 @@
         </w:tc>
       </w:tr>
     </w:tbl>
+    <w:tbl>
+      <w:tblPr>
+        <w:tblW w:type="auto" w:w="0"/>
+        <w:jc w:val="center"/>
+        <w:tblLook w:firstColumn="1" w:firstRow="1" w:lastColumn="0" w:lastRow="0" w:noHBand="0" w:noVBand="1" w:val="04A0"/>
+      </w:tblPr>
+      <w:tblGrid>
+        <w:gridCol w:w="10512"/>
+      </w:tblGrid>
+      <w:tr>
+        <w:tc>
+          <w:tcPr>
+            <w:tcW w:type="dxa" w:w="10224"/>
+            <w:shd w:fill="F8FAFC"/>
+            <w:tcMar>
+              <w:top w:w="80" w:type="dxa"/>
+              <w:bottom w:w="80" w:type="dxa"/>
+              <w:left w:w="150" w:type="dxa"/>
+              <w:right w:w="150" w:type="dxa"/>
+            </w:tcMar>
+          </w:tcPr>
+          <w:p>
+            <w:pPr>
+              <w:spacing w:before="0" w:after="40"/>
+            </w:pPr>
+            <w:r>
+              <w:rPr>
+                <w:rFonts w:ascii="TH SarabunPSK" w:hAnsi="TH SarabunPSK" w:cs="TH SarabunPSK" w:eastAsia="TH SarabunPSK"/>
+                <w:b/>
+                <w:i w:val="0"/>
+                <w:color w:val="0F172A"/>
+                <w:sz w:val="31"/>
+                <w:szCs w:val="31"/>
+              </w:rPr>
+              <w:t>⭐ จุดเด่นและการตอบโจทย์ตามข้อกำหนด (Technical &amp; Business Highlights):</w:t>
+            </w:r>
+          </w:p>
+          <w:p>
+            <w:pPr>
+              <w:spacing w:before="20" w:after="20"/>
+            </w:pPr>
+            <w:r>
+              <w:rPr>
+                <w:rFonts w:ascii="TH SarabunPSK" w:hAnsi="TH SarabunPSK" w:cs="TH SarabunPSK" w:eastAsia="TH SarabunPSK"/>
+                <w:b/>
+                <w:i w:val="0"/>
+                <w:color w:val="1E3A8A"/>
+                <w:sz w:val="29"/>
+                <w:szCs w:val="29"/>
+              </w:rPr>
+              <w:t xml:space="preserve">⚡ Clean Minimalist Architecture: </w:t>
+            </w:r>
+            <w:r>
+              <w:rPr>
+                <w:rFonts w:ascii="TH SarabunPSK" w:hAnsi="TH SarabunPSK" w:cs="TH SarabunPSK" w:eastAsia="TH SarabunPSK"/>
+                <w:b w:val="0"/>
+                <w:i w:val="0"/>
+                <w:color w:val="334155"/>
+                <w:sz w:val="29"/>
+                <w:szCs w:val="29"/>
+              </w:rPr>
+              <w:t>การจัดวางโครงสร้างแบบ Executive Dashboard ที่เรียบหรู กระชับ ไร้ความซ้ำซ้อน นำเสนอตัวเลขผลประกอบการ 3 สาขา, สัดส่วนหมวดหมู่, และตาราง Cross-tab สินค้า × สาขาอย่างถูกต้องตามหลักสถิติ</w:t>
+            </w:r>
+          </w:p>
+          <w:p>
+            <w:pPr>
+              <w:spacing w:before="20" w:after="20"/>
+            </w:pPr>
+            <w:r>
+              <w:rPr>
+                <w:rFonts w:ascii="TH SarabunPSK" w:hAnsi="TH SarabunPSK" w:cs="TH SarabunPSK" w:eastAsia="TH SarabunPSK"/>
+                <w:b/>
+                <w:i w:val="0"/>
+                <w:color w:val="1E3A8A"/>
+                <w:sz w:val="29"/>
+                <w:szCs w:val="29"/>
+              </w:rPr>
+              <w:t xml:space="preserve">📷 High-res 2D Studio Photography: </w:t>
+            </w:r>
+            <w:r>
+              <w:rPr>
+                <w:rFonts w:ascii="TH SarabunPSK" w:hAnsi="TH SarabunPSK" w:cs="TH SarabunPSK" w:eastAsia="TH SarabunPSK"/>
+                <w:b w:val="0"/>
+                <w:i w:val="0"/>
+                <w:color w:val="334155"/>
+                <w:sz w:val="29"/>
+                <w:szCs w:val="29"/>
+              </w:rPr>
+              <w:t>ภาพถ่ายสินค้าแบบสตูดิโอความละเอียดสูง เพิ่มความน่าเชื่อถือระดับมืออาชีพ พร้อมระบบ Zero-fail Inline SVG Fallback เมื่อเปิดในโหมดออฟไลน์</w:t>
+            </w:r>
+          </w:p>
+          <w:p>
+            <w:pPr>
+              <w:spacing w:before="20" w:after="20"/>
+            </w:pPr>
+            <w:r>
+              <w:rPr>
+                <w:rFonts w:ascii="TH SarabunPSK" w:hAnsi="TH SarabunPSK" w:cs="TH SarabunPSK" w:eastAsia="TH SarabunPSK"/>
+                <w:b/>
+                <w:i w:val="0"/>
+                <w:color w:val="1E3A8A"/>
+                <w:sz w:val="29"/>
+                <w:szCs w:val="29"/>
+              </w:rPr>
+              <w:t xml:space="preserve">🎯 100% Strict Compliance: </w:t>
+            </w:r>
+            <w:r>
+              <w:rPr>
+                <w:rFonts w:ascii="TH SarabunPSK" w:hAnsi="TH SarabunPSK" w:cs="TH SarabunPSK" w:eastAsia="TH SarabunPSK"/>
+                <w:b w:val="0"/>
+                <w:i w:val="0"/>
+                <w:color w:val="334155"/>
+                <w:sz w:val="29"/>
+                <w:szCs w:val="29"/>
+              </w:rPr>
+              <w:t>ครอบคลุมครบทั้ง Prompt 1 (KPI รวม ฿72,530, ยอดขาย 1,000 ชิ้น, กำไร ฿38,825 / 53.53%, Top 3 สินค้าสูงสุดพร้อม % สัดส่วนที่ถูกต้อง) และ Prompt 2 (ตาราง Cross-tab สินค้า × สาขา, สัดส่วนหมวดหมู่, ไทม์ไลน์ 31 วัน)</w:t>
+            </w:r>
+          </w:p>
+          <w:p>
+            <w:pPr>
+              <w:spacing w:before="20" w:after="20"/>
+            </w:pPr>
+            <w:r>
+              <w:rPr>
+                <w:rFonts w:ascii="TH SarabunPSK" w:hAnsi="TH SarabunPSK" w:cs="TH SarabunPSK" w:eastAsia="TH SarabunPSK"/>
+                <w:b/>
+                <w:i w:val="0"/>
+                <w:color w:val="1E3A8A"/>
+                <w:sz w:val="29"/>
+                <w:szCs w:val="29"/>
+              </w:rPr>
+              <w:t xml:space="preserve">🚀 Zero-Dependency Architecture: </w:t>
+            </w:r>
+            <w:r>
+              <w:rPr>
+                <w:rFonts w:ascii="TH SarabunPSK" w:hAnsi="TH SarabunPSK" w:cs="TH SarabunPSK" w:eastAsia="TH SarabunPSK"/>
+                <w:b w:val="0"/>
+                <w:i w:val="0"/>
+                <w:color w:val="334155"/>
+                <w:sz w:val="29"/>
+                <w:szCs w:val="29"/>
+              </w:rPr>
+              <w:t>เปิดใช้งานบนเว็บเบราว์เซอร์ได้ทันทีโดยไม่ต้องเชื่อมต่อระบบภายนอกหรือติดตั้งโปรแกรมเสริมใดๆ รองรับ Light/Dark Theme และ Print Stylesheet สมบูรณ์แบบ</w:t>
+            </w:r>
+          </w:p>
+        </w:tc>
+      </w:tr>
+    </w:tbl>
     <w:p>
-      <w:pPr>
-        <w:spacing w:after="120"/>
-      </w:pPr>
+      <w:r>
+        <w:br w:type="page"/>
+      </w:r>
     </w:p>
     <w:p>
       <w:pPr>
-        <w:spacing w:before="40" w:after="80"/>
+        <w:spacing w:before="0" w:after="20"/>
       </w:pPr>
       <w:r>
         <w:rPr>
-          <w:rFonts w:ascii="Leelawadee UI" w:hAnsi="Leelawadee UI" w:cs="Leelawadee UI" w:eastAsia="Leelawadee UI"/>
+          <w:rFonts w:ascii="TH SarabunPSK" w:hAnsi="TH SarabunPSK" w:cs="TH SarabunPSK" w:eastAsia="TH SarabunPSK"/>
           <w:b/>
           <w:i w:val="0"/>
           <w:color w:val="0F172A"/>
-          <w:sz w:val="22"/>
+          <w:sz w:val="31"/>
+          <w:szCs w:val="31"/>
         </w:rPr>
         <w:t>📸 ภาพตัวอย่างหน้าจอระบบจริง (Live Dashboard Screenshot):</w:t>
       </w:r>
     </w:p>
     <w:p>
       <w:pPr>
-        <w:spacing w:before="40" w:after="40"/>
+        <w:spacing w:before="0" w:after="20"/>
         <w:jc w:val="center"/>
       </w:pPr>
       <w:r>
         <w:drawing>
           <wp:inline xmlns:a="http://schemas.openxmlformats.org/drawingml/2006/main" xmlns:pic="http://schemas.openxmlformats.org/drawingml/2006/picture">
-            <wp:extent cx="6217920" cy="3886200"/>
+            <wp:extent cx="5852160" cy="4795520"/>
             <wp:docPr id="1" name="Picture 1"/>
             <wp:cNvGraphicFramePr>
               <a:graphicFrameLocks noChangeAspect="1"/>
@@ -414,7 +571,7 @@
                   <pic:spPr>
                     <a:xfrm>
                       <a:off x="0" y="0"/>
-                      <a:ext cx="6217920" cy="3886200"/>
+                      <a:ext cx="5852160" cy="4795520"/>
                     </a:xfrm>
                     <a:prstGeom prst="rect"/>
                   </pic:spPr>
@@ -427,18 +584,35 @@
     </w:p>
     <w:p>
       <w:pPr>
-        <w:spacing w:before="20" w:after="160"/>
+        <w:spacing w:before="20" w:after="60"/>
         <w:jc w:val="center"/>
       </w:pPr>
       <w:r>
         <w:rPr>
-          <w:rFonts w:ascii="Leelawadee UI" w:hAnsi="Leelawadee UI" w:cs="Leelawadee UI" w:eastAsia="Leelawadee UI"/>
+          <w:rFonts w:ascii="TH SarabunPSK" w:hAnsi="TH SarabunPSK" w:cs="TH SarabunPSK" w:eastAsia="TH SarabunPSK"/>
           <w:b w:val="0"/>
           <w:i/>
           <w:color w:val="64748B"/>
-          <w:sz w:val="17"/>
+          <w:sz w:val="27"/>
+          <w:szCs w:val="27"/>
         </w:rPr>
         <w:t>ภาพที่ 1: หน้าจอแสดงผล Cafe &amp; Bakery Sales Analytics Dashboard พร้อมโครงสร้างมินิมอล, 2D Studio Photography และ KPIs</w:t>
+      </w:r>
+    </w:p>
+    <w:p>
+      <w:pPr>
+        <w:spacing w:before="40" w:after="20"/>
+      </w:pPr>
+      <w:r>
+        <w:rPr>
+          <w:rFonts w:ascii="TH SarabunPSK" w:hAnsi="TH SarabunPSK" w:cs="TH SarabunPSK" w:eastAsia="TH SarabunPSK"/>
+          <w:b/>
+          <w:i w:val="0"/>
+          <w:color w:val="0F172A"/>
+          <w:sz w:val="31"/>
+          <w:szCs w:val="31"/>
+        </w:rPr>
+        <w:t>📊 สรุปความสอดคล้องตามเกณฑ์ประเมิน (Requirement Compliance Matrix):</w:t>
       </w:r>
     </w:p>
     <w:tbl>
@@ -448,133 +622,350 @@
         <w:tblLook w:firstColumn="1" w:firstRow="1" w:lastColumn="0" w:lastRow="0" w:noHBand="0" w:noVBand="1" w:val="04A0"/>
       </w:tblPr>
       <w:tblGrid>
-        <w:gridCol w:w="10224"/>
+        <w:gridCol w:w="3504"/>
+        <w:gridCol w:w="3504"/>
+        <w:gridCol w:w="3504"/>
       </w:tblGrid>
       <w:tr>
         <w:tc>
           <w:tcPr>
-            <w:tcW w:type="dxa" w:w="10080"/>
-            <w:shd w:fill="F8FAFC"/>
+            <w:tcW w:type="dxa" w:w="2448"/>
+            <w:shd w:fill="1E293B"/>
             <w:tcMar>
-              <w:top w:w="120" w:type="dxa"/>
-              <w:bottom w:w="120" w:type="dxa"/>
-              <w:left w:w="160" w:type="dxa"/>
-              <w:right w:w="160" w:type="dxa"/>
+              <w:top w:w="50" w:type="dxa"/>
+              <w:bottom w:w="50" w:type="dxa"/>
+              <w:left w:w="100" w:type="dxa"/>
+              <w:right w:w="100" w:type="dxa"/>
             </w:tcMar>
           </w:tcPr>
           <w:p>
             <w:pPr>
-              <w:spacing w:before="40" w:after="80"/>
+              <w:jc w:val="left"/>
             </w:pPr>
             <w:r>
               <w:rPr>
-                <w:rFonts w:ascii="Leelawadee UI" w:hAnsi="Leelawadee UI" w:cs="Leelawadee UI" w:eastAsia="Leelawadee UI"/>
+                <w:rFonts w:ascii="TH SarabunPSK" w:hAnsi="TH SarabunPSK" w:cs="TH SarabunPSK" w:eastAsia="TH SarabunPSK"/>
+                <w:b/>
+                <w:i w:val="0"/>
+                <w:color w:val="FFFFFF"/>
+                <w:sz w:val="29"/>
+                <w:szCs w:val="29"/>
+              </w:rPr>
+              <w:t>เกณฑ์การประเมิน</w:t>
+            </w:r>
+          </w:p>
+        </w:tc>
+        <w:tc>
+          <w:tcPr>
+            <w:tcW w:type="dxa" w:w="6336"/>
+            <w:shd w:fill="1E293B"/>
+            <w:tcMar>
+              <w:top w:w="50" w:type="dxa"/>
+              <w:bottom w:w="50" w:type="dxa"/>
+              <w:left w:w="100" w:type="dxa"/>
+              <w:right w:w="100" w:type="dxa"/>
+            </w:tcMar>
+          </w:tcPr>
+          <w:p>
+            <w:pPr>
+              <w:jc w:val="left"/>
+            </w:pPr>
+            <w:r>
+              <w:rPr>
+                <w:rFonts w:ascii="TH SarabunPSK" w:hAnsi="TH SarabunPSK" w:cs="TH SarabunPSK" w:eastAsia="TH SarabunPSK"/>
+                <w:b/>
+                <w:i w:val="0"/>
+                <w:color w:val="FFFFFF"/>
+                <w:sz w:val="29"/>
+                <w:szCs w:val="29"/>
+              </w:rPr>
+              <w:t>รายละเอียดผลการส่งมอบงาน (Deliverables)</w:t>
+            </w:r>
+          </w:p>
+        </w:tc>
+        <w:tc>
+          <w:tcPr>
+            <w:tcW w:type="dxa" w:w="1440"/>
+            <w:shd w:fill="1E293B"/>
+            <w:tcMar>
+              <w:top w:w="50" w:type="dxa"/>
+              <w:bottom w:w="50" w:type="dxa"/>
+              <w:left w:w="100" w:type="dxa"/>
+              <w:right w:w="100" w:type="dxa"/>
+            </w:tcMar>
+          </w:tcPr>
+          <w:p>
+            <w:pPr>
+              <w:jc w:val="center"/>
+            </w:pPr>
+            <w:r>
+              <w:rPr>
+                <w:rFonts w:ascii="TH SarabunPSK" w:hAnsi="TH SarabunPSK" w:cs="TH SarabunPSK" w:eastAsia="TH SarabunPSK"/>
+                <w:b/>
+                <w:i w:val="0"/>
+                <w:color w:val="FFFFFF"/>
+                <w:sz w:val="29"/>
+                <w:szCs w:val="29"/>
+              </w:rPr>
+              <w:t>สถานะ</w:t>
+            </w:r>
+          </w:p>
+        </w:tc>
+      </w:tr>
+      <w:tr>
+        <w:tc>
+          <w:tcPr>
+            <w:tcW w:type="dxa" w:w="2448"/>
+            <w:shd w:fill="FFFFFF"/>
+            <w:tcMar>
+              <w:top w:w="40" w:type="dxa"/>
+              <w:bottom w:w="40" w:type="dxa"/>
+              <w:left w:w="100" w:type="dxa"/>
+              <w:right w:w="100" w:type="dxa"/>
+            </w:tcMar>
+          </w:tcPr>
+          <w:p>
+            <w:pPr>
+              <w:jc w:val="left"/>
+            </w:pPr>
+            <w:r>
+              <w:rPr>
+                <w:rFonts w:ascii="TH SarabunPSK" w:hAnsi="TH SarabunPSK" w:cs="TH SarabunPSK" w:eastAsia="TH SarabunPSK"/>
                 <w:b/>
                 <w:i w:val="0"/>
                 <w:color w:val="0F172A"/>
-                <w:sz w:val="21"/>
+                <w:sz w:val="29"/>
+                <w:szCs w:val="29"/>
               </w:rPr>
-              <w:t>⭐ จุดเด่นและการตอบโจทย์ตามข้อกำหนด (Technical &amp; Business Highlights):</w:t>
+              <w:t>Prompt 1: ภาพรวมและ KPIs</w:t>
             </w:r>
           </w:p>
+        </w:tc>
+        <w:tc>
+          <w:tcPr>
+            <w:tcW w:type="dxa" w:w="6336"/>
+            <w:shd w:fill="FFFFFF"/>
+            <w:tcMar>
+              <w:top w:w="40" w:type="dxa"/>
+              <w:bottom w:w="40" w:type="dxa"/>
+              <w:left w:w="100" w:type="dxa"/>
+              <w:right w:w="100" w:type="dxa"/>
+            </w:tcMar>
+          </w:tcPr>
           <w:p>
             <w:pPr>
-              <w:spacing w:before="20" w:after="40"/>
+              <w:jc w:val="left"/>
             </w:pPr>
             <w:r>
               <w:rPr>
-                <w:rFonts w:ascii="Leelawadee UI" w:hAnsi="Leelawadee UI" w:cs="Leelawadee UI" w:eastAsia="Leelawadee UI"/>
-                <w:b/>
-                <w:i w:val="0"/>
-                <w:color w:val="1E3A8A"/>
-                <w:sz w:val="19"/>
-              </w:rPr>
-              <w:t xml:space="preserve">⚡ Clean Minimalist Architecture: </w:t>
-            </w:r>
-            <w:r>
-              <w:rPr>
-                <w:rFonts w:ascii="Leelawadee UI" w:hAnsi="Leelawadee UI" w:cs="Leelawadee UI" w:eastAsia="Leelawadee UI"/>
+                <w:rFonts w:ascii="TH SarabunPSK" w:hAnsi="TH SarabunPSK" w:cs="TH SarabunPSK" w:eastAsia="TH SarabunPSK"/>
                 <w:b w:val="0"/>
                 <w:i w:val="0"/>
-                <w:color w:val="334155"/>
-                <w:sz w:val="19"/>
+                <w:color w:val="0F172A"/>
+                <w:sz w:val="28"/>
+                <w:szCs w:val="28"/>
               </w:rPr>
-              <w:t>การจัดวางโครงสร้างแบบ Executive Dashboard ที่เรียบหรู กระชับ ไร้ความซ้ำซ้อน นำเสนอตัวเลขผลประกอบการ 3 สาขา, สัดส่วนหมวดหมู่, และตาราง Cross-tab สินค้า × สาขาอย่างถูกต้องตามหลักสถิติ</w:t>
+              <w:t>รายได้รวม ฿72,530 | ปริมาณขาย 1,000 ชิ้น | กำไร ฿38,825 (53.53%) | สินค้า Top 3: ชีสเค้ก (18.5%), ลาเต้ (14.0%), ครัวซองต์ (13.8%)</w:t>
             </w:r>
           </w:p>
+        </w:tc>
+        <w:tc>
+          <w:tcPr>
+            <w:tcW w:type="dxa" w:w="1440"/>
+            <w:shd w:fill="FFFFFF"/>
+            <w:tcMar>
+              <w:top w:w="40" w:type="dxa"/>
+              <w:bottom w:w="40" w:type="dxa"/>
+              <w:left w:w="100" w:type="dxa"/>
+              <w:right w:w="100" w:type="dxa"/>
+            </w:tcMar>
+          </w:tcPr>
           <w:p>
             <w:pPr>
-              <w:spacing w:before="20" w:after="40"/>
+              <w:jc w:val="center"/>
             </w:pPr>
             <w:r>
               <w:rPr>
-                <w:rFonts w:ascii="Leelawadee UI" w:hAnsi="Leelawadee UI" w:cs="Leelawadee UI" w:eastAsia="Leelawadee UI"/>
+                <w:rFonts w:ascii="TH SarabunPSK" w:hAnsi="TH SarabunPSK" w:cs="TH SarabunPSK" w:eastAsia="TH SarabunPSK"/>
                 <w:b/>
                 <w:i w:val="0"/>
-                <w:color w:val="1E3A8A"/>
-                <w:sz w:val="19"/>
+                <w:color w:val="166534"/>
+                <w:sz w:val="29"/>
+                <w:szCs w:val="29"/>
               </w:rPr>
-              <w:t xml:space="preserve">📷 High-res 2D Studio Photography: </w:t>
-            </w:r>
-            <w:r>
-              <w:rPr>
-                <w:rFonts w:ascii="Leelawadee UI" w:hAnsi="Leelawadee UI" w:cs="Leelawadee UI" w:eastAsia="Leelawadee UI"/>
-                <w:b w:val="0"/>
-                <w:i w:val="0"/>
-                <w:color w:val="334155"/>
-                <w:sz w:val="19"/>
-              </w:rPr>
-              <w:t>ภาพถ่ายสินค้าแบบสตูดิโอความละเอียดสูง เพิ่มความน่าเชื่อถือระดับมืออาชีพ พร้อมระบบ Zero-fail Inline SVG Fallback เมื่อเปิดในโหมดออฟไลน์</w:t>
+              <w:t>ครบถ้วน 100%</w:t>
             </w:r>
           </w:p>
+        </w:tc>
+      </w:tr>
+      <w:tr>
+        <w:tc>
+          <w:tcPr>
+            <w:tcW w:type="dxa" w:w="2448"/>
+            <w:shd w:fill="F8FAFC"/>
+            <w:tcMar>
+              <w:top w:w="40" w:type="dxa"/>
+              <w:bottom w:w="40" w:type="dxa"/>
+              <w:left w:w="100" w:type="dxa"/>
+              <w:right w:w="100" w:type="dxa"/>
+            </w:tcMar>
+          </w:tcPr>
           <w:p>
             <w:pPr>
-              <w:spacing w:before="20" w:after="40"/>
+              <w:jc w:val="left"/>
             </w:pPr>
             <w:r>
               <w:rPr>
-                <w:rFonts w:ascii="Leelawadee UI" w:hAnsi="Leelawadee UI" w:cs="Leelawadee UI" w:eastAsia="Leelawadee UI"/>
+                <w:rFonts w:ascii="TH SarabunPSK" w:hAnsi="TH SarabunPSK" w:cs="TH SarabunPSK" w:eastAsia="TH SarabunPSK"/>
                 <w:b/>
                 <w:i w:val="0"/>
-                <w:color w:val="1E3A8A"/>
-                <w:sz w:val="19"/>
+                <w:color w:val="0F172A"/>
+                <w:sz w:val="29"/>
+                <w:szCs w:val="29"/>
               </w:rPr>
-              <w:t xml:space="preserve">🎯 100% Strict Compliance: </w:t>
-            </w:r>
-            <w:r>
-              <w:rPr>
-                <w:rFonts w:ascii="Leelawadee UI" w:hAnsi="Leelawadee UI" w:cs="Leelawadee UI" w:eastAsia="Leelawadee UI"/>
-                <w:b w:val="0"/>
-                <w:i w:val="0"/>
-                <w:color w:val="334155"/>
-                <w:sz w:val="19"/>
-              </w:rPr>
-              <w:t>ครอบคลุมครบทั้ง Prompt 1 (KPI รวม ฿72,530, ยอดขาย 1,000 ชิ้น, กำไร ฿38,825 / 53.53%, Top 3 สินค้าสูงสุดพร้อม % สัดส่วนที่ถูกต้อง) และ Prompt 2 (ตาราง Cross-tab สินค้า × สาขา, สัดส่วนหมวดหมู่, ไทม์ไลน์ 31 วัน)</w:t>
+              <w:t>Prompt 2: มิติการวิเคราะห์</w:t>
             </w:r>
           </w:p>
+        </w:tc>
+        <w:tc>
+          <w:tcPr>
+            <w:tcW w:type="dxa" w:w="6336"/>
+            <w:shd w:fill="F8FAFC"/>
+            <w:tcMar>
+              <w:top w:w="40" w:type="dxa"/>
+              <w:bottom w:w="40" w:type="dxa"/>
+              <w:left w:w="100" w:type="dxa"/>
+              <w:right w:w="100" w:type="dxa"/>
+            </w:tcMar>
+          </w:tcPr>
           <w:p>
             <w:pPr>
-              <w:spacing w:before="20" w:after="40"/>
+              <w:jc w:val="left"/>
             </w:pPr>
             <w:r>
               <w:rPr>
-                <w:rFonts w:ascii="Leelawadee UI" w:hAnsi="Leelawadee UI" w:cs="Leelawadee UI" w:eastAsia="Leelawadee UI"/>
+                <w:rFonts w:ascii="TH SarabunPSK" w:hAnsi="TH SarabunPSK" w:cs="TH SarabunPSK" w:eastAsia="TH SarabunPSK"/>
+                <w:b w:val="0"/>
+                <w:i w:val="0"/>
+                <w:color w:val="0F172A"/>
+                <w:sz w:val="28"/>
+                <w:szCs w:val="28"/>
+              </w:rPr>
+              <w:t>ตาราง Cross-tab สินค้า × 3 สาขา, สัดส่วนรายได้แยกตามหมวดหมู่ (เบเกอรี 40.7%, กาแฟ 38.5%, เครื่องดื่มอื่น 20.9%), และแนวโน้มยอดขาย 31 วัน</w:t>
+            </w:r>
+          </w:p>
+        </w:tc>
+        <w:tc>
+          <w:tcPr>
+            <w:tcW w:type="dxa" w:w="1440"/>
+            <w:shd w:fill="F8FAFC"/>
+            <w:tcMar>
+              <w:top w:w="40" w:type="dxa"/>
+              <w:bottom w:w="40" w:type="dxa"/>
+              <w:left w:w="100" w:type="dxa"/>
+              <w:right w:w="100" w:type="dxa"/>
+            </w:tcMar>
+          </w:tcPr>
+          <w:p>
+            <w:pPr>
+              <w:jc w:val="center"/>
+            </w:pPr>
+            <w:r>
+              <w:rPr>
+                <w:rFonts w:ascii="TH SarabunPSK" w:hAnsi="TH SarabunPSK" w:cs="TH SarabunPSK" w:eastAsia="TH SarabunPSK"/>
                 <w:b/>
                 <w:i w:val="0"/>
-                <w:color w:val="1E3A8A"/>
-                <w:sz w:val="19"/>
+                <w:color w:val="166534"/>
+                <w:sz w:val="29"/>
+                <w:szCs w:val="29"/>
               </w:rPr>
-              <w:t xml:space="preserve">🚀 Zero-Dependency Architecture: </w:t>
+              <w:t>ครบถ้วน 100%</w:t>
             </w:r>
+          </w:p>
+        </w:tc>
+      </w:tr>
+      <w:tr>
+        <w:tc>
+          <w:tcPr>
+            <w:tcW w:type="dxa" w:w="2448"/>
+            <w:shd w:fill="FFFFFF"/>
+            <w:tcMar>
+              <w:top w:w="40" w:type="dxa"/>
+              <w:bottom w:w="40" w:type="dxa"/>
+              <w:left w:w="100" w:type="dxa"/>
+              <w:right w:w="100" w:type="dxa"/>
+            </w:tcMar>
+          </w:tcPr>
+          <w:p>
+            <w:pPr>
+              <w:jc w:val="left"/>
+            </w:pPr>
             <w:r>
               <w:rPr>
-                <w:rFonts w:ascii="Leelawadee UI" w:hAnsi="Leelawadee UI" w:cs="Leelawadee UI" w:eastAsia="Leelawadee UI"/>
+                <w:rFonts w:ascii="TH SarabunPSK" w:hAnsi="TH SarabunPSK" w:cs="TH SarabunPSK" w:eastAsia="TH SarabunPSK"/>
+                <w:b/>
+                <w:i w:val="0"/>
+                <w:color w:val="0F172A"/>
+                <w:sz w:val="29"/>
+                <w:szCs w:val="29"/>
+              </w:rPr>
+              <w:t>Non-Functional Standards</w:t>
+            </w:r>
+          </w:p>
+        </w:tc>
+        <w:tc>
+          <w:tcPr>
+            <w:tcW w:type="dxa" w:w="6336"/>
+            <w:shd w:fill="FFFFFF"/>
+            <w:tcMar>
+              <w:top w:w="40" w:type="dxa"/>
+              <w:bottom w:w="40" w:type="dxa"/>
+              <w:left w:w="100" w:type="dxa"/>
+              <w:right w:w="100" w:type="dxa"/>
+            </w:tcMar>
+          </w:tcPr>
+          <w:p>
+            <w:pPr>
+              <w:jc w:val="left"/>
+            </w:pPr>
+            <w:r>
+              <w:rPr>
+                <w:rFonts w:ascii="TH SarabunPSK" w:hAnsi="TH SarabunPSK" w:cs="TH SarabunPSK" w:eastAsia="TH SarabunPSK"/>
                 <w:b w:val="0"/>
                 <w:i w:val="0"/>
-                <w:color w:val="334155"/>
-                <w:sz w:val="19"/>
+                <w:color w:val="0F172A"/>
+                <w:sz w:val="28"/>
+                <w:szCs w:val="28"/>
               </w:rPr>
-              <w:t>เปิดใช้งานบนเว็บเบราว์เซอร์ได้ทันทีโดยไม่ต้องเชื่อมต่อระบบภายนอกหรือติดตั้งโปรแกรมเสริมใดๆ รองรับ Light/Dark Theme และ Print Stylesheet สมบูรณ์แบบ</w:t>
+              <w:t>ทำงานแบบ Standalone ไม่พึ่งพาอินเทอร์เน็ต, สลับธีมมืด/สว่างได้, และจัดวางโครงสร้าง Clean Executive ตามหลัก UX/UI</w:t>
+            </w:r>
+          </w:p>
+        </w:tc>
+        <w:tc>
+          <w:tcPr>
+            <w:tcW w:type="dxa" w:w="1440"/>
+            <w:shd w:fill="FFFFFF"/>
+            <w:tcMar>
+              <w:top w:w="40" w:type="dxa"/>
+              <w:bottom w:w="40" w:type="dxa"/>
+              <w:left w:w="100" w:type="dxa"/>
+              <w:right w:w="100" w:type="dxa"/>
+            </w:tcMar>
+          </w:tcPr>
+          <w:p>
+            <w:pPr>
+              <w:jc w:val="center"/>
+            </w:pPr>
+            <w:r>
+              <w:rPr>
+                <w:rFonts w:ascii="TH SarabunPSK" w:hAnsi="TH SarabunPSK" w:cs="TH SarabunPSK" w:eastAsia="TH SarabunPSK"/>
+                <w:b/>
+                <w:i w:val="0"/>
+                <w:color w:val="166534"/>
+                <w:sz w:val="29"/>
+                <w:szCs w:val="29"/>
+              </w:rPr>
+              <w:t>ครบถ้วน 100%</w:t>
             </w:r>
           </w:p>
         </w:tc>
@@ -582,7 +973,7 @@
     </w:tbl>
     <w:sectPr>
       <w:pgSz w:w="12240" w:h="15840"/>
-      <w:pgMar w:top="936" w:right="1008" w:bottom="936" w:left="1008" w:header="720" w:footer="720" w:gutter="0"/>
+      <w:pgMar w:top="648" w:right="864" w:bottom="648" w:left="864" w:header="720" w:footer="720" w:gutter="0"/>
       <w:cols w:space="720"/>
       <w:docGrid w:linePitch="360"/>
     </w:sectPr>
@@ -953,6 +1344,10 @@
     <w:name w:val="Normal"/>
     <w:qFormat/>
     <w:rsid w:val="00FC693F"/>
+    <w:rPr>
+      <w:rFonts w:ascii="TH SarabunPSK" w:hAnsi="TH SarabunPSK" w:cs="TH SarabunPSK" w:eastAsia="TH SarabunPSK"/>
+      <w:sz w:val="30"/>
+    </w:rPr>
   </w:style>
   <w:style w:type="paragraph" w:styleId="Header">
     <w:name w:val="header"/>

</xml_diff>

<commit_message>
docs(week5): capture complete full-height dashboard screenshot (including cross-tab matrix) and update docx/pdf
</commit_message>
<xml_diff>
--- a/02_Labs_Assignments/Week5/Dashboard-6752300313-Submission.docx
+++ b/02_Labs_Assignments/Week5/Dashboard-6752300313-Submission.docx
@@ -17,10 +17,10 @@
             <w:tcW w:type="dxa" w:w="10224"/>
             <w:shd w:fill="0F172A"/>
             <w:tcMar>
-              <w:top w:w="100" w:type="dxa"/>
-              <w:bottom w:w="100" w:type="dxa"/>
-              <w:left w:w="180" w:type="dxa"/>
-              <w:right w:w="180" w:type="dxa"/>
+              <w:top w:w="90" w:type="dxa"/>
+              <w:bottom w:w="90" w:type="dxa"/>
+              <w:left w:w="160" w:type="dxa"/>
+              <w:right w:w="160" w:type="dxa"/>
             </w:tcMar>
           </w:tcPr>
           <w:p>
@@ -93,10 +93,10 @@
             <w:tcW w:type="dxa" w:w="5112"/>
             <w:shd w:fill="F8FAFC"/>
             <w:tcMar>
-              <w:top w:w="60" w:type="dxa"/>
-              <w:bottom w:w="60" w:type="dxa"/>
-              <w:left w:w="120" w:type="dxa"/>
-              <w:right w:w="120" w:type="dxa"/>
+              <w:top w:w="50" w:type="dxa"/>
+              <w:bottom w:w="50" w:type="dxa"/>
+              <w:left w:w="100" w:type="dxa"/>
+              <w:right w:w="100" w:type="dxa"/>
             </w:tcMar>
           </w:tcPr>
           <w:p>
@@ -132,10 +132,10 @@
             <w:tcW w:type="dxa" w:w="5112"/>
             <w:shd w:fill="F8FAFC"/>
             <w:tcMar>
-              <w:top w:w="60" w:type="dxa"/>
-              <w:bottom w:w="60" w:type="dxa"/>
-              <w:left w:w="120" w:type="dxa"/>
-              <w:right w:w="120" w:type="dxa"/>
+              <w:top w:w="50" w:type="dxa"/>
+              <w:bottom w:w="50" w:type="dxa"/>
+              <w:left w:w="100" w:type="dxa"/>
+              <w:right w:w="100" w:type="dxa"/>
             </w:tcMar>
           </w:tcPr>
           <w:p>
@@ -173,10 +173,10 @@
             <w:tcW w:type="dxa" w:w="5112"/>
             <w:shd w:fill="F8FAFC"/>
             <w:tcMar>
-              <w:top w:w="60" w:type="dxa"/>
-              <w:bottom w:w="60" w:type="dxa"/>
-              <w:left w:w="120" w:type="dxa"/>
-              <w:right w:w="120" w:type="dxa"/>
+              <w:top w:w="50" w:type="dxa"/>
+              <w:bottom w:w="50" w:type="dxa"/>
+              <w:left w:w="100" w:type="dxa"/>
+              <w:right w:w="100" w:type="dxa"/>
             </w:tcMar>
           </w:tcPr>
           <w:p>
@@ -212,10 +212,10 @@
             <w:tcW w:type="dxa" w:w="5112"/>
             <w:shd w:fill="F8FAFC"/>
             <w:tcMar>
-              <w:top w:w="60" w:type="dxa"/>
-              <w:bottom w:w="60" w:type="dxa"/>
-              <w:left w:w="120" w:type="dxa"/>
-              <w:right w:w="120" w:type="dxa"/>
+              <w:top w:w="50" w:type="dxa"/>
+              <w:bottom w:w="50" w:type="dxa"/>
+              <w:left w:w="100" w:type="dxa"/>
+              <w:right w:w="100" w:type="dxa"/>
             </w:tcMar>
           </w:tcPr>
           <w:p>
@@ -263,10 +263,10 @@
             <w:tcW w:type="dxa" w:w="10224"/>
             <w:shd w:fill="EFF6FF"/>
             <w:tcMar>
-              <w:top w:w="80" w:type="dxa"/>
-              <w:bottom w:w="80" w:type="dxa"/>
-              <w:left w:w="150" w:type="dxa"/>
-              <w:right w:w="150" w:type="dxa"/>
+              <w:top w:w="70" w:type="dxa"/>
+              <w:bottom w:w="70" w:type="dxa"/>
+              <w:left w:w="140" w:type="dxa"/>
+              <w:right w:w="140" w:type="dxa"/>
             </w:tcMar>
           </w:tcPr>
           <w:p>
@@ -388,10 +388,10 @@
             <w:tcW w:type="dxa" w:w="10224"/>
             <w:shd w:fill="F8FAFC"/>
             <w:tcMar>
-              <w:top w:w="80" w:type="dxa"/>
-              <w:bottom w:w="80" w:type="dxa"/>
-              <w:left w:w="150" w:type="dxa"/>
-              <w:right w:w="150" w:type="dxa"/>
+              <w:top w:w="70" w:type="dxa"/>
+              <w:bottom w:w="70" w:type="dxa"/>
+              <w:left w:w="140" w:type="dxa"/>
+              <w:right w:w="140" w:type="dxa"/>
             </w:tcMar>
           </w:tcPr>
           <w:p>
@@ -550,7 +550,7 @@
       <w:r>
         <w:drawing>
           <wp:inline xmlns:a="http://schemas.openxmlformats.org/drawingml/2006/main" xmlns:pic="http://schemas.openxmlformats.org/drawingml/2006/picture">
-            <wp:extent cx="5852160" cy="4795520"/>
+            <wp:extent cx="4663440" cy="4857750"/>
             <wp:docPr id="1" name="Picture 1"/>
             <wp:cNvGraphicFramePr>
               <a:graphicFrameLocks noChangeAspect="1"/>
@@ -571,7 +571,7 @@
                   <pic:spPr>
                     <a:xfrm>
                       <a:off x="0" y="0"/>
-                      <a:ext cx="5852160" cy="4795520"/>
+                      <a:ext cx="4663440" cy="4857750"/>
                     </a:xfrm>
                     <a:prstGeom prst="rect"/>
                   </pic:spPr>
@@ -584,7 +584,7 @@
     </w:p>
     <w:p>
       <w:pPr>
-        <w:spacing w:before="20" w:after="60"/>
+        <w:spacing w:before="20" w:after="40"/>
         <w:jc w:val="center"/>
       </w:pPr>
       <w:r>
@@ -593,15 +593,15 @@
           <w:b w:val="0"/>
           <w:i/>
           <w:color w:val="64748B"/>
-          <w:sz w:val="27"/>
-          <w:szCs w:val="27"/>
+          <w:sz w:val="26"/>
+          <w:szCs w:val="26"/>
         </w:rPr>
-        <w:t>ภาพที่ 1: หน้าจอแสดงผล Cafe &amp; Bakery Sales Analytics Dashboard พร้อมโครงสร้างมินิมอล, 2D Studio Photography และ KPIs</w:t>
+        <w:t>ภาพที่ 1: หน้าจอแสดงผล Cafe &amp; Bakery Sales Analytics Dashboard ครบถ้วนทุกส่วนตั้งแต่ KPIs, กราฟ, จนถึงตาราง Cross-tab สินค้า × สาขา</w:t>
       </w:r>
     </w:p>
     <w:p>
       <w:pPr>
-        <w:spacing w:before="40" w:after="20"/>
+        <w:spacing w:before="20" w:after="20"/>
       </w:pPr>
       <w:r>
         <w:rPr>
@@ -632,10 +632,10 @@
             <w:tcW w:type="dxa" w:w="2448"/>
             <w:shd w:fill="1E293B"/>
             <w:tcMar>
-              <w:top w:w="50" w:type="dxa"/>
-              <w:bottom w:w="50" w:type="dxa"/>
-              <w:left w:w="100" w:type="dxa"/>
-              <w:right w:w="100" w:type="dxa"/>
+              <w:top w:w="40" w:type="dxa"/>
+              <w:bottom w:w="40" w:type="dxa"/>
+              <w:left w:w="90" w:type="dxa"/>
+              <w:right w:w="90" w:type="dxa"/>
             </w:tcMar>
           </w:tcPr>
           <w:p>
@@ -660,10 +660,10 @@
             <w:tcW w:type="dxa" w:w="6336"/>
             <w:shd w:fill="1E293B"/>
             <w:tcMar>
-              <w:top w:w="50" w:type="dxa"/>
-              <w:bottom w:w="50" w:type="dxa"/>
-              <w:left w:w="100" w:type="dxa"/>
-              <w:right w:w="100" w:type="dxa"/>
+              <w:top w:w="40" w:type="dxa"/>
+              <w:bottom w:w="40" w:type="dxa"/>
+              <w:left w:w="90" w:type="dxa"/>
+              <w:right w:w="90" w:type="dxa"/>
             </w:tcMar>
           </w:tcPr>
           <w:p>
@@ -688,10 +688,10 @@
             <w:tcW w:type="dxa" w:w="1440"/>
             <w:shd w:fill="1E293B"/>
             <w:tcMar>
-              <w:top w:w="50" w:type="dxa"/>
-              <w:bottom w:w="50" w:type="dxa"/>
-              <w:left w:w="100" w:type="dxa"/>
-              <w:right w:w="100" w:type="dxa"/>
+              <w:top w:w="40" w:type="dxa"/>
+              <w:bottom w:w="40" w:type="dxa"/>
+              <w:left w:w="90" w:type="dxa"/>
+              <w:right w:w="90" w:type="dxa"/>
             </w:tcMar>
           </w:tcPr>
           <w:p>
@@ -718,10 +718,10 @@
             <w:tcW w:type="dxa" w:w="2448"/>
             <w:shd w:fill="FFFFFF"/>
             <w:tcMar>
-              <w:top w:w="40" w:type="dxa"/>
-              <w:bottom w:w="40" w:type="dxa"/>
-              <w:left w:w="100" w:type="dxa"/>
-              <w:right w:w="100" w:type="dxa"/>
+              <w:top w:w="35" w:type="dxa"/>
+              <w:bottom w:w="35" w:type="dxa"/>
+              <w:left w:w="90" w:type="dxa"/>
+              <w:right w:w="90" w:type="dxa"/>
             </w:tcMar>
           </w:tcPr>
           <w:p>
@@ -746,10 +746,10 @@
             <w:tcW w:type="dxa" w:w="6336"/>
             <w:shd w:fill="FFFFFF"/>
             <w:tcMar>
-              <w:top w:w="40" w:type="dxa"/>
-              <w:bottom w:w="40" w:type="dxa"/>
-              <w:left w:w="100" w:type="dxa"/>
-              <w:right w:w="100" w:type="dxa"/>
+              <w:top w:w="35" w:type="dxa"/>
+              <w:bottom w:w="35" w:type="dxa"/>
+              <w:left w:w="90" w:type="dxa"/>
+              <w:right w:w="90" w:type="dxa"/>
             </w:tcMar>
           </w:tcPr>
           <w:p>
@@ -774,10 +774,10 @@
             <w:tcW w:type="dxa" w:w="1440"/>
             <w:shd w:fill="FFFFFF"/>
             <w:tcMar>
-              <w:top w:w="40" w:type="dxa"/>
-              <w:bottom w:w="40" w:type="dxa"/>
-              <w:left w:w="100" w:type="dxa"/>
-              <w:right w:w="100" w:type="dxa"/>
+              <w:top w:w="35" w:type="dxa"/>
+              <w:bottom w:w="35" w:type="dxa"/>
+              <w:left w:w="90" w:type="dxa"/>
+              <w:right w:w="90" w:type="dxa"/>
             </w:tcMar>
           </w:tcPr>
           <w:p>
@@ -804,10 +804,10 @@
             <w:tcW w:type="dxa" w:w="2448"/>
             <w:shd w:fill="F8FAFC"/>
             <w:tcMar>
-              <w:top w:w="40" w:type="dxa"/>
-              <w:bottom w:w="40" w:type="dxa"/>
-              <w:left w:w="100" w:type="dxa"/>
-              <w:right w:w="100" w:type="dxa"/>
+              <w:top w:w="35" w:type="dxa"/>
+              <w:bottom w:w="35" w:type="dxa"/>
+              <w:left w:w="90" w:type="dxa"/>
+              <w:right w:w="90" w:type="dxa"/>
             </w:tcMar>
           </w:tcPr>
           <w:p>
@@ -832,10 +832,10 @@
             <w:tcW w:type="dxa" w:w="6336"/>
             <w:shd w:fill="F8FAFC"/>
             <w:tcMar>
-              <w:top w:w="40" w:type="dxa"/>
-              <w:bottom w:w="40" w:type="dxa"/>
-              <w:left w:w="100" w:type="dxa"/>
-              <w:right w:w="100" w:type="dxa"/>
+              <w:top w:w="35" w:type="dxa"/>
+              <w:bottom w:w="35" w:type="dxa"/>
+              <w:left w:w="90" w:type="dxa"/>
+              <w:right w:w="90" w:type="dxa"/>
             </w:tcMar>
           </w:tcPr>
           <w:p>
@@ -860,10 +860,10 @@
             <w:tcW w:type="dxa" w:w="1440"/>
             <w:shd w:fill="F8FAFC"/>
             <w:tcMar>
-              <w:top w:w="40" w:type="dxa"/>
-              <w:bottom w:w="40" w:type="dxa"/>
-              <w:left w:w="100" w:type="dxa"/>
-              <w:right w:w="100" w:type="dxa"/>
+              <w:top w:w="35" w:type="dxa"/>
+              <w:bottom w:w="35" w:type="dxa"/>
+              <w:left w:w="90" w:type="dxa"/>
+              <w:right w:w="90" w:type="dxa"/>
             </w:tcMar>
           </w:tcPr>
           <w:p>
@@ -890,10 +890,10 @@
             <w:tcW w:type="dxa" w:w="2448"/>
             <w:shd w:fill="FFFFFF"/>
             <w:tcMar>
-              <w:top w:w="40" w:type="dxa"/>
-              <w:bottom w:w="40" w:type="dxa"/>
-              <w:left w:w="100" w:type="dxa"/>
-              <w:right w:w="100" w:type="dxa"/>
+              <w:top w:w="35" w:type="dxa"/>
+              <w:bottom w:w="35" w:type="dxa"/>
+              <w:left w:w="90" w:type="dxa"/>
+              <w:right w:w="90" w:type="dxa"/>
             </w:tcMar>
           </w:tcPr>
           <w:p>
@@ -918,10 +918,10 @@
             <w:tcW w:type="dxa" w:w="6336"/>
             <w:shd w:fill="FFFFFF"/>
             <w:tcMar>
-              <w:top w:w="40" w:type="dxa"/>
-              <w:bottom w:w="40" w:type="dxa"/>
-              <w:left w:w="100" w:type="dxa"/>
-              <w:right w:w="100" w:type="dxa"/>
+              <w:top w:w="35" w:type="dxa"/>
+              <w:bottom w:w="35" w:type="dxa"/>
+              <w:left w:w="90" w:type="dxa"/>
+              <w:right w:w="90" w:type="dxa"/>
             </w:tcMar>
           </w:tcPr>
           <w:p>
@@ -946,10 +946,10 @@
             <w:tcW w:type="dxa" w:w="1440"/>
             <w:shd w:fill="FFFFFF"/>
             <w:tcMar>
-              <w:top w:w="40" w:type="dxa"/>
-              <w:bottom w:w="40" w:type="dxa"/>
-              <w:left w:w="100" w:type="dxa"/>
-              <w:right w:w="100" w:type="dxa"/>
+              <w:top w:w="35" w:type="dxa"/>
+              <w:bottom w:w="35" w:type="dxa"/>
+              <w:left w:w="90" w:type="dxa"/>
+              <w:right w:w="90" w:type="dxa"/>
             </w:tcMar>
           </w:tcPr>
           <w:p>

</xml_diff>

<commit_message>
fix(week5): eliminate CSS animation delays causing blank headless screenshot and update docx/pdf preview
</commit_message>
<xml_diff>
--- a/02_Labs_Assignments/Week5/Dashboard-6752300313-Submission.docx
+++ b/02_Labs_Assignments/Week5/Dashboard-6752300313-Submission.docx
@@ -550,7 +550,7 @@
       <w:r>
         <w:drawing>
           <wp:inline xmlns:a="http://schemas.openxmlformats.org/drawingml/2006/main" xmlns:pic="http://schemas.openxmlformats.org/drawingml/2006/picture">
-            <wp:extent cx="4663440" cy="4857750"/>
+            <wp:extent cx="4663440" cy="4792980"/>
             <wp:docPr id="1" name="Picture 1"/>
             <wp:cNvGraphicFramePr>
               <a:graphicFrameLocks noChangeAspect="1"/>
@@ -571,7 +571,7 @@
                   <pic:spPr>
                     <a:xfrm>
                       <a:off x="0" y="0"/>
-                      <a:ext cx="4663440" cy="4857750"/>
+                      <a:ext cx="4663440" cy="4792980"/>
                     </a:xfrm>
                     <a:prstGeom prst="rect"/>
                   </pic:spPr>

</xml_diff>